<commit_message>
Update Power Query staging and cleaning documentation
Imported and cleaned staging tables in Power BI, documented breakdown event timestamp handling, created fuel usage quality flags, and updated project build documentation.
</commit_message>
<xml_diff>
--- a/06_docs/Data_Cleaning_Log.docx
+++ b/06_docs/Data_Cleaning_Log.docx
@@ -2032,6 +2032,552 @@
       </w:pPr>
       <w:r>
         <w:t>- Re-run total-hours validation after correcting the hour fields.</w:t>
+      </w:r>
+    </w:p>
+    <w:p>
+      <w:pPr>
+        <w:spacing w:after="0" w:line="240" w:lineRule="auto"/>
+      </w:pPr>
+    </w:p>
+    <w:p>
+      <w:pPr>
+        <w:spacing w:after="0" w:line="240" w:lineRule="auto"/>
+      </w:pPr>
+    </w:p>
+    <w:p>
+      <w:pPr>
+        <w:spacing w:after="0" w:line="240" w:lineRule="auto"/>
+      </w:pPr>
+      <w:r>
+        <w:t>Power Query:</w:t>
+      </w:r>
+    </w:p>
+    <w:p>
+      <w:pPr>
+        <w:spacing w:after="0" w:line="240" w:lineRule="auto"/>
+      </w:pPr>
+    </w:p>
+    <w:p>
+      <w:pPr>
+        <w:spacing w:after="0" w:line="240" w:lineRule="auto"/>
+      </w:pPr>
+    </w:p>
+    <w:p>
+      <w:pPr>
+        <w:spacing w:after="0" w:line="240" w:lineRule="auto"/>
+      </w:pPr>
+      <w:r>
+        <w:tab/>
+      </w:r>
+      <w:r>
+        <w:t>breakdown_events.csv</w:t>
+      </w:r>
+    </w:p>
+    <w:p>
+      <w:pPr>
+        <w:spacing w:after="0" w:line="240" w:lineRule="auto"/>
+      </w:pPr>
+    </w:p>
+    <w:p>
+      <w:pPr>
+        <w:spacing w:after="0" w:line="240" w:lineRule="auto"/>
+      </w:pPr>
+      <w:r>
+        <w:t>Power Query cleaning update:</w:t>
+      </w:r>
+    </w:p>
+    <w:p>
+      <w:pPr>
+        <w:spacing w:after="0" w:line="240" w:lineRule="auto"/>
+      </w:pPr>
+      <w:r>
+        <w:t xml:space="preserve">- Imported breakdown_events.csv into Power Query and renamed the query to </w:t>
+      </w:r>
+      <w:proofErr w:type="spellStart"/>
+      <w:r>
+        <w:t>stg_breakdown_events</w:t>
+      </w:r>
+      <w:proofErr w:type="spellEnd"/>
+      <w:r>
+        <w:t>.</w:t>
+      </w:r>
+    </w:p>
+    <w:p>
+      <w:pPr>
+        <w:spacing w:after="0" w:line="240" w:lineRule="auto"/>
+      </w:pPr>
+      <w:r>
+        <w:t xml:space="preserve">- Confirmed the expected columns were present: </w:t>
+      </w:r>
+      <w:proofErr w:type="spellStart"/>
+      <w:r>
+        <w:t>breakdown_id</w:t>
+      </w:r>
+      <w:proofErr w:type="spellEnd"/>
+      <w:r>
+        <w:t xml:space="preserve">, </w:t>
+      </w:r>
+      <w:proofErr w:type="spellStart"/>
+      <w:r>
+        <w:t>asset_id</w:t>
+      </w:r>
+      <w:proofErr w:type="spellEnd"/>
+      <w:r>
+        <w:t xml:space="preserve">, </w:t>
+      </w:r>
+      <w:proofErr w:type="spellStart"/>
+      <w:r>
+        <w:t>event_start</w:t>
+      </w:r>
+      <w:proofErr w:type="spellEnd"/>
+      <w:r>
+        <w:t xml:space="preserve">, </w:t>
+      </w:r>
+      <w:proofErr w:type="spellStart"/>
+      <w:r>
+        <w:t>event_end</w:t>
+      </w:r>
+      <w:proofErr w:type="spellEnd"/>
+      <w:r>
+        <w:t xml:space="preserve">, </w:t>
+      </w:r>
+      <w:proofErr w:type="spellStart"/>
+      <w:r>
+        <w:t>failure_system</w:t>
+      </w:r>
+      <w:proofErr w:type="spellEnd"/>
+      <w:r>
+        <w:t xml:space="preserve">, </w:t>
+      </w:r>
+      <w:proofErr w:type="spellStart"/>
+      <w:r>
+        <w:t>failure_mode</w:t>
+      </w:r>
+      <w:proofErr w:type="spellEnd"/>
+      <w:r>
+        <w:t xml:space="preserve">, severity, </w:t>
+      </w:r>
+      <w:proofErr w:type="spellStart"/>
+      <w:r>
+        <w:t>production_lost_tonnes</w:t>
+      </w:r>
+      <w:proofErr w:type="spellEnd"/>
+      <w:r>
+        <w:t xml:space="preserve">, </w:t>
+      </w:r>
+      <w:proofErr w:type="spellStart"/>
+      <w:r>
+        <w:t>root_cause</w:t>
+      </w:r>
+      <w:proofErr w:type="spellEnd"/>
+      <w:r>
+        <w:t xml:space="preserve"> and </w:t>
+      </w:r>
+      <w:proofErr w:type="spellStart"/>
+      <w:r>
+        <w:t>linked_work_order_id</w:t>
+      </w:r>
+      <w:proofErr w:type="spellEnd"/>
+      <w:r>
+        <w:t>.</w:t>
+      </w:r>
+    </w:p>
+    <w:p>
+      <w:pPr>
+        <w:spacing w:after="0" w:line="240" w:lineRule="auto"/>
+      </w:pPr>
+      <w:r>
+        <w:t xml:space="preserve">- Set </w:t>
+      </w:r>
+      <w:proofErr w:type="spellStart"/>
+      <w:r>
+        <w:t>event_start</w:t>
+      </w:r>
+      <w:proofErr w:type="spellEnd"/>
+      <w:r>
+        <w:t xml:space="preserve"> and </w:t>
+      </w:r>
+      <w:proofErr w:type="spellStart"/>
+      <w:r>
+        <w:t>event_end</w:t>
+      </w:r>
+      <w:proofErr w:type="spellEnd"/>
+      <w:r>
+        <w:t xml:space="preserve"> to Date/Time.</w:t>
+      </w:r>
+    </w:p>
+    <w:p>
+      <w:pPr>
+        <w:spacing w:after="0" w:line="240" w:lineRule="auto"/>
+      </w:pPr>
+      <w:r>
+        <w:t xml:space="preserve">- Set </w:t>
+      </w:r>
+      <w:proofErr w:type="spellStart"/>
+      <w:r>
+        <w:t>production_lost_tonnes</w:t>
+      </w:r>
+      <w:proofErr w:type="spellEnd"/>
+      <w:r>
+        <w:t xml:space="preserve"> to Decimal Number.</w:t>
+      </w:r>
+    </w:p>
+    <w:p>
+      <w:pPr>
+        <w:spacing w:after="0" w:line="240" w:lineRule="auto"/>
+      </w:pPr>
+      <w:r>
+        <w:t xml:space="preserve">- Set </w:t>
+      </w:r>
+      <w:proofErr w:type="spellStart"/>
+      <w:r>
+        <w:t>breakdown_id</w:t>
+      </w:r>
+      <w:proofErr w:type="spellEnd"/>
+      <w:r>
+        <w:t xml:space="preserve">, </w:t>
+      </w:r>
+      <w:proofErr w:type="spellStart"/>
+      <w:r>
+        <w:t>asset_id</w:t>
+      </w:r>
+      <w:proofErr w:type="spellEnd"/>
+      <w:r>
+        <w:t xml:space="preserve">, </w:t>
+      </w:r>
+      <w:proofErr w:type="spellStart"/>
+      <w:r>
+        <w:t>failure_system</w:t>
+      </w:r>
+      <w:proofErr w:type="spellEnd"/>
+      <w:r>
+        <w:t xml:space="preserve">, </w:t>
+      </w:r>
+      <w:proofErr w:type="spellStart"/>
+      <w:r>
+        <w:t>failure_mode</w:t>
+      </w:r>
+      <w:proofErr w:type="spellEnd"/>
+      <w:r>
+        <w:t xml:space="preserve">, severity, </w:t>
+      </w:r>
+      <w:proofErr w:type="spellStart"/>
+      <w:r>
+        <w:t>root_cause</w:t>
+      </w:r>
+      <w:proofErr w:type="spellEnd"/>
+      <w:r>
+        <w:t xml:space="preserve"> and </w:t>
+      </w:r>
+      <w:proofErr w:type="spellStart"/>
+      <w:r>
+        <w:t>linked_work_order_id</w:t>
+      </w:r>
+      <w:proofErr w:type="spellEnd"/>
+      <w:r>
+        <w:t xml:space="preserve"> to Text.</w:t>
+      </w:r>
+    </w:p>
+    <w:p>
+      <w:pPr>
+        <w:spacing w:after="0" w:line="240" w:lineRule="auto"/>
+      </w:pPr>
+      <w:r>
+        <w:t xml:space="preserve">- Rounded </w:t>
+      </w:r>
+      <w:proofErr w:type="spellStart"/>
+      <w:r>
+        <w:t>event_start</w:t>
+      </w:r>
+      <w:proofErr w:type="spellEnd"/>
+      <w:r>
+        <w:t xml:space="preserve"> and </w:t>
+      </w:r>
+      <w:proofErr w:type="spellStart"/>
+      <w:r>
+        <w:t>event_end</w:t>
+      </w:r>
+      <w:proofErr w:type="spellEnd"/>
+      <w:r>
+        <w:t xml:space="preserve"> to the nearest second to fix timestamp artifacts such as 11:47:59.999999999.</w:t>
+      </w:r>
+    </w:p>
+    <w:p>
+      <w:pPr>
+        <w:spacing w:after="0" w:line="240" w:lineRule="auto"/>
+      </w:pPr>
+      <w:r>
+        <w:t>- Reapplied Date/Time type after the timestamp rounding step because the transformation reset the columns to a generic type.</w:t>
+      </w:r>
+    </w:p>
+    <w:p>
+      <w:pPr>
+        <w:spacing w:after="0" w:line="240" w:lineRule="auto"/>
+      </w:pPr>
+    </w:p>
+    <w:p>
+      <w:pPr>
+        <w:spacing w:after="0" w:line="240" w:lineRule="auto"/>
+      </w:pPr>
+      <w:r>
+        <w:t>Cleaning decision:</w:t>
+      </w:r>
+    </w:p>
+    <w:p>
+      <w:pPr>
+        <w:spacing w:after="0" w:line="240" w:lineRule="auto"/>
+      </w:pPr>
+      <w:r>
+        <w:t>The timestamp artifacts were corrected because they were serialization issues, not meaningful operational time differences. The breakdown event records were retained rather than removed.</w:t>
+      </w:r>
+    </w:p>
+    <w:p>
+      <w:pPr>
+        <w:spacing w:after="0" w:line="240" w:lineRule="auto"/>
+      </w:pPr>
+    </w:p>
+    <w:p>
+      <w:pPr>
+        <w:spacing w:after="0" w:line="240" w:lineRule="auto"/>
+      </w:pPr>
+      <w:r>
+        <w:t>Impact on analysis:</w:t>
+      </w:r>
+    </w:p>
+    <w:p>
+      <w:pPr>
+        <w:spacing w:after="0" w:line="240" w:lineRule="auto"/>
+      </w:pPr>
+      <w:r>
+        <w:t>Breakdown start and end times can now be used more reliably for downtime duration, trend analysis and relationship checks with work orders.</w:t>
+      </w:r>
+    </w:p>
+    <w:p>
+      <w:pPr>
+        <w:spacing w:after="0" w:line="240" w:lineRule="auto"/>
+      </w:pPr>
+      <w:r>
+        <w:tab/>
+      </w:r>
+    </w:p>
+    <w:p>
+      <w:pPr>
+        <w:spacing w:after="0" w:line="240" w:lineRule="auto"/>
+      </w:pPr>
+    </w:p>
+    <w:p>
+      <w:pPr>
+        <w:spacing w:after="0" w:line="240" w:lineRule="auto"/>
+      </w:pPr>
+      <w:r>
+        <w:tab/>
+      </w:r>
+      <w:r>
+        <w:t>fuel_usage.csv</w:t>
+      </w:r>
+    </w:p>
+    <w:p>
+      <w:pPr>
+        <w:spacing w:after="0" w:line="240" w:lineRule="auto"/>
+      </w:pPr>
+    </w:p>
+    <w:p>
+      <w:pPr>
+        <w:spacing w:after="0" w:line="240" w:lineRule="auto"/>
+      </w:pPr>
+      <w:r>
+        <w:t>Power Query cleaning update:</w:t>
+      </w:r>
+    </w:p>
+    <w:p>
+      <w:pPr>
+        <w:spacing w:after="0" w:line="240" w:lineRule="auto"/>
+      </w:pPr>
+      <w:r>
+        <w:t xml:space="preserve">- Imported fuel_usage.csv into Power Query and renamed the query to </w:t>
+      </w:r>
+      <w:proofErr w:type="spellStart"/>
+      <w:r>
+        <w:t>stg_fuel_usage</w:t>
+      </w:r>
+      <w:proofErr w:type="spellEnd"/>
+      <w:r>
+        <w:t>.</w:t>
+      </w:r>
+    </w:p>
+    <w:p>
+      <w:pPr>
+        <w:spacing w:after="0" w:line="240" w:lineRule="auto"/>
+      </w:pPr>
+      <w:r>
+        <w:t xml:space="preserve">- Set </w:t>
+      </w:r>
+      <w:proofErr w:type="spellStart"/>
+      <w:r>
+        <w:t>operating_hours</w:t>
+      </w:r>
+      <w:proofErr w:type="spellEnd"/>
+      <w:r>
+        <w:t xml:space="preserve">, </w:t>
+      </w:r>
+      <w:proofErr w:type="spellStart"/>
+      <w:r>
+        <w:t>fuel_litres</w:t>
+      </w:r>
+      <w:proofErr w:type="spellEnd"/>
+      <w:r>
+        <w:t xml:space="preserve"> and </w:t>
+      </w:r>
+      <w:proofErr w:type="spellStart"/>
+      <w:r>
+        <w:t>fuel_cost_aud</w:t>
+      </w:r>
+      <w:proofErr w:type="spellEnd"/>
+      <w:r>
+        <w:t xml:space="preserve"> to Decimal Number.</w:t>
+      </w:r>
+    </w:p>
+    <w:p>
+      <w:pPr>
+        <w:spacing w:after="0" w:line="240" w:lineRule="auto"/>
+      </w:pPr>
+      <w:r>
+        <w:t xml:space="preserve">- Kept </w:t>
+      </w:r>
+      <w:proofErr w:type="spellStart"/>
+      <w:r>
+        <w:t>fuel_litres</w:t>
+      </w:r>
+      <w:proofErr w:type="spellEnd"/>
+      <w:r>
+        <w:t xml:space="preserve"> null values as null rather than replacing them with zero.</w:t>
+      </w:r>
+    </w:p>
+    <w:p>
+      <w:pPr>
+        <w:spacing w:after="0" w:line="240" w:lineRule="auto"/>
+      </w:pPr>
+      <w:r>
+        <w:t xml:space="preserve">- Created </w:t>
+      </w:r>
+      <w:proofErr w:type="spellStart"/>
+      <w:r>
+        <w:t>Fuel_Record_Quality_Flag</w:t>
+      </w:r>
+      <w:proofErr w:type="spellEnd"/>
+      <w:r>
+        <w:t xml:space="preserve"> to classify fuel records as Valid fuel record or Missing fuel litres.</w:t>
+      </w:r>
+    </w:p>
+    <w:p>
+      <w:pPr>
+        <w:spacing w:after="0" w:line="240" w:lineRule="auto"/>
+      </w:pPr>
+      <w:r>
+        <w:t xml:space="preserve">- Created </w:t>
+      </w:r>
+      <w:proofErr w:type="spellStart"/>
+      <w:r>
+        <w:t>Asset_ID_Standardised</w:t>
+      </w:r>
+      <w:proofErr w:type="spellEnd"/>
+      <w:r>
+        <w:t xml:space="preserve"> to standardise inconsistent asset ID formatting, including lowercase IDs and IDs missing hyphens.</w:t>
+      </w:r>
+    </w:p>
+    <w:p>
+      <w:pPr>
+        <w:spacing w:after="0" w:line="240" w:lineRule="auto"/>
+      </w:pPr>
+      <w:r>
+        <w:t xml:space="preserve">- Created </w:t>
+      </w:r>
+      <w:proofErr w:type="spellStart"/>
+      <w:r>
+        <w:t>Include_In_Fuel_Analysis</w:t>
+      </w:r>
+      <w:proofErr w:type="spellEnd"/>
+      <w:r>
+        <w:t xml:space="preserve"> to identify which rows are safe to include in fuel-consumption KPIs.</w:t>
+      </w:r>
+    </w:p>
+    <w:p>
+      <w:pPr>
+        <w:spacing w:after="0" w:line="240" w:lineRule="auto"/>
+      </w:pPr>
+      <w:r>
+        <w:t>- Power Query validation did not confirm blank asset IDs. The issue was inconsistent asset ID formatting rather than true missing asset IDs.</w:t>
+      </w:r>
+    </w:p>
+    <w:p>
+      <w:pPr>
+        <w:spacing w:after="0" w:line="240" w:lineRule="auto"/>
+      </w:pPr>
+    </w:p>
+    <w:p>
+      <w:pPr>
+        <w:spacing w:after="0" w:line="240" w:lineRule="auto"/>
+      </w:pPr>
+      <w:r>
+        <w:t>Cleaning decision:</w:t>
+      </w:r>
+    </w:p>
+    <w:p>
+      <w:pPr>
+        <w:spacing w:after="0" w:line="240" w:lineRule="auto"/>
+      </w:pPr>
+      <w:r>
+        <w:t xml:space="preserve">Rows with missing </w:t>
+      </w:r>
+      <w:proofErr w:type="spellStart"/>
+      <w:r>
+        <w:t>fuel_litres</w:t>
+      </w:r>
+      <w:proofErr w:type="spellEnd"/>
+      <w:r>
+        <w:t xml:space="preserve"> will be retained for transparency but excluded from fuel-consumption KPI calculations using </w:t>
+      </w:r>
+      <w:proofErr w:type="spellStart"/>
+      <w:r>
+        <w:t>Include_In_Fuel_Analysis</w:t>
+      </w:r>
+      <w:proofErr w:type="spellEnd"/>
+      <w:r>
+        <w:t>.</w:t>
+      </w:r>
+    </w:p>
+    <w:p>
+      <w:pPr>
+        <w:spacing w:after="0" w:line="240" w:lineRule="auto"/>
+      </w:pPr>
+    </w:p>
+    <w:p>
+      <w:pPr>
+        <w:spacing w:after="0" w:line="240" w:lineRule="auto"/>
+      </w:pPr>
+      <w:r>
+        <w:t>Impact on analysis:</w:t>
+      </w:r>
+    </w:p>
+    <w:p>
+      <w:pPr>
+        <w:spacing w:after="0" w:line="240" w:lineRule="auto"/>
+      </w:pPr>
+      <w:r>
+        <w:t>Fuel KPIs will use only complete fuel records, while incomplete records remain available for data-quality reporting.</w:t>
+      </w:r>
+    </w:p>
+    <w:p>
+      <w:pPr>
+        <w:spacing w:after="0" w:line="240" w:lineRule="auto"/>
+      </w:pPr>
+    </w:p>
+    <w:p>
+      <w:pPr>
+        <w:spacing w:after="0" w:line="240" w:lineRule="auto"/>
+      </w:pPr>
+      <w:r>
+        <w:tab/>
       </w:r>
     </w:p>
     <w:sectPr>

</xml_diff>

<commit_message>
Clean maintenance work orders and standardise evidence names
Updated Power Query cleaning for maintenance work orders, standardised failure categories, added work order quality and inclusion flags, updated project documentation, and renamed screenshot evidence files for consistency.
</commit_message>
<xml_diff>
--- a/06_docs/Data_Cleaning_Log.docx
+++ b/06_docs/Data_Cleaning_Log.docx
@@ -2576,6 +2576,481 @@
       <w:pPr>
         <w:spacing w:after="0" w:line="240" w:lineRule="auto"/>
       </w:pPr>
+      <w:r>
+        <w:tab/>
+      </w:r>
+      <w:r>
+        <w:t>maintenance_work_orders.csv</w:t>
+      </w:r>
+    </w:p>
+    <w:p>
+      <w:pPr>
+        <w:spacing w:after="0" w:line="240" w:lineRule="auto"/>
+      </w:pPr>
+    </w:p>
+    <w:p>
+      <w:pPr>
+        <w:spacing w:after="0" w:line="240" w:lineRule="auto"/>
+      </w:pPr>
+      <w:r>
+        <w:t>Power Query cleaning update:</w:t>
+      </w:r>
+    </w:p>
+    <w:p>
+      <w:pPr>
+        <w:spacing w:after="0" w:line="240" w:lineRule="auto"/>
+      </w:pPr>
+      <w:r>
+        <w:t xml:space="preserve">- Imported maintenance_work_orders.csv into Power Query and renamed the query to </w:t>
+      </w:r>
+      <w:proofErr w:type="spellStart"/>
+      <w:r>
+        <w:t>stg_maintenance_work_orders</w:t>
+      </w:r>
+      <w:proofErr w:type="spellEnd"/>
+      <w:r>
+        <w:t>.</w:t>
+      </w:r>
+    </w:p>
+    <w:p>
+      <w:pPr>
+        <w:spacing w:after="0" w:line="240" w:lineRule="auto"/>
+      </w:pPr>
+      <w:r>
+        <w:t>- Confirmed 707 rows loaded.</w:t>
+      </w:r>
+    </w:p>
+    <w:p>
+      <w:pPr>
+        <w:spacing w:after="0" w:line="240" w:lineRule="auto"/>
+      </w:pPr>
+      <w:r>
+        <w:t xml:space="preserve">- Confirmed the expected columns were present: </w:t>
+      </w:r>
+      <w:proofErr w:type="spellStart"/>
+      <w:r>
+        <w:t>work_order_id</w:t>
+      </w:r>
+      <w:proofErr w:type="spellEnd"/>
+      <w:r>
+        <w:t xml:space="preserve">, </w:t>
+      </w:r>
+      <w:proofErr w:type="spellStart"/>
+      <w:r>
+        <w:t>asset_id</w:t>
+      </w:r>
+      <w:proofErr w:type="spellEnd"/>
+      <w:r>
+        <w:t xml:space="preserve">, </w:t>
+      </w:r>
+      <w:proofErr w:type="spellStart"/>
+      <w:r>
+        <w:t>date_raised</w:t>
+      </w:r>
+      <w:proofErr w:type="spellEnd"/>
+      <w:r>
+        <w:t xml:space="preserve">, </w:t>
+      </w:r>
+      <w:proofErr w:type="spellStart"/>
+      <w:r>
+        <w:t>planned_start_date</w:t>
+      </w:r>
+      <w:proofErr w:type="spellEnd"/>
+      <w:r>
+        <w:t xml:space="preserve">, </w:t>
+      </w:r>
+      <w:proofErr w:type="spellStart"/>
+      <w:r>
+        <w:t>actual_start_date</w:t>
+      </w:r>
+      <w:proofErr w:type="spellEnd"/>
+      <w:r>
+        <w:t xml:space="preserve">, </w:t>
+      </w:r>
+      <w:proofErr w:type="spellStart"/>
+      <w:r>
+        <w:t>actual_finish_date</w:t>
+      </w:r>
+      <w:proofErr w:type="spellEnd"/>
+      <w:r>
+        <w:t xml:space="preserve">, </w:t>
+      </w:r>
+      <w:proofErr w:type="spellStart"/>
+      <w:r>
+        <w:t>maintenance_type</w:t>
+      </w:r>
+      <w:proofErr w:type="spellEnd"/>
+      <w:r>
+        <w:t xml:space="preserve">, </w:t>
+      </w:r>
+      <w:proofErr w:type="spellStart"/>
+      <w:r>
+        <w:t>work_order_status</w:t>
+      </w:r>
+      <w:proofErr w:type="spellEnd"/>
+      <w:r>
+        <w:t xml:space="preserve">, </w:t>
+      </w:r>
+      <w:proofErr w:type="spellStart"/>
+      <w:r>
+        <w:t>failure_code</w:t>
+      </w:r>
+      <w:proofErr w:type="spellEnd"/>
+      <w:r>
+        <w:t xml:space="preserve">, </w:t>
+      </w:r>
+      <w:proofErr w:type="spellStart"/>
+      <w:r>
+        <w:t>failure_description</w:t>
+      </w:r>
+      <w:proofErr w:type="spellEnd"/>
+      <w:r>
+        <w:t xml:space="preserve">, priority, </w:t>
+      </w:r>
+      <w:proofErr w:type="spellStart"/>
+      <w:r>
+        <w:t>labour_hours</w:t>
+      </w:r>
+      <w:proofErr w:type="spellEnd"/>
+      <w:r>
+        <w:t xml:space="preserve">, </w:t>
+      </w:r>
+      <w:proofErr w:type="spellStart"/>
+      <w:r>
+        <w:t>materials_cost_aud</w:t>
+      </w:r>
+      <w:proofErr w:type="spellEnd"/>
+      <w:r>
+        <w:t xml:space="preserve">, </w:t>
+      </w:r>
+      <w:proofErr w:type="spellStart"/>
+      <w:r>
+        <w:t>external_service_cost_aud</w:t>
+      </w:r>
+      <w:proofErr w:type="spellEnd"/>
+      <w:r>
+        <w:t xml:space="preserve">, </w:t>
+      </w:r>
+      <w:proofErr w:type="spellStart"/>
+      <w:r>
+        <w:t>downtime_hours</w:t>
+      </w:r>
+      <w:proofErr w:type="spellEnd"/>
+      <w:r>
+        <w:t xml:space="preserve"> and </w:t>
+      </w:r>
+      <w:proofErr w:type="spellStart"/>
+      <w:r>
+        <w:t>crew_id</w:t>
+      </w:r>
+      <w:proofErr w:type="spellEnd"/>
+      <w:r>
+        <w:t>.</w:t>
+      </w:r>
+    </w:p>
+    <w:p>
+      <w:pPr>
+        <w:spacing w:after="0" w:line="240" w:lineRule="auto"/>
+      </w:pPr>
+      <w:r>
+        <w:t xml:space="preserve">- Set </w:t>
+      </w:r>
+      <w:proofErr w:type="spellStart"/>
+      <w:r>
+        <w:t>date_raised</w:t>
+      </w:r>
+      <w:proofErr w:type="spellEnd"/>
+      <w:r>
+        <w:t xml:space="preserve">, </w:t>
+      </w:r>
+      <w:proofErr w:type="spellStart"/>
+      <w:r>
+        <w:t>planned_start_date</w:t>
+      </w:r>
+      <w:proofErr w:type="spellEnd"/>
+      <w:r>
+        <w:t xml:space="preserve">, </w:t>
+      </w:r>
+      <w:proofErr w:type="spellStart"/>
+      <w:r>
+        <w:t>actual_start_date</w:t>
+      </w:r>
+      <w:proofErr w:type="spellEnd"/>
+      <w:r>
+        <w:t xml:space="preserve"> and </w:t>
+      </w:r>
+      <w:proofErr w:type="spellStart"/>
+      <w:r>
+        <w:t>actual_finish_date</w:t>
+      </w:r>
+      <w:proofErr w:type="spellEnd"/>
+      <w:r>
+        <w:t xml:space="preserve"> to Date.</w:t>
+      </w:r>
+    </w:p>
+    <w:p>
+      <w:pPr>
+        <w:spacing w:after="0" w:line="240" w:lineRule="auto"/>
+      </w:pPr>
+      <w:r>
+        <w:lastRenderedPageBreak/>
+        <w:t xml:space="preserve">- Set </w:t>
+      </w:r>
+      <w:proofErr w:type="spellStart"/>
+      <w:r>
+        <w:t>labour_hours</w:t>
+      </w:r>
+      <w:proofErr w:type="spellEnd"/>
+      <w:r>
+        <w:t xml:space="preserve">, </w:t>
+      </w:r>
+      <w:proofErr w:type="spellStart"/>
+      <w:r>
+        <w:t>materials_cost_aud</w:t>
+      </w:r>
+      <w:proofErr w:type="spellEnd"/>
+      <w:r>
+        <w:t xml:space="preserve">, </w:t>
+      </w:r>
+      <w:proofErr w:type="spellStart"/>
+      <w:r>
+        <w:t>external_service_cost_aud</w:t>
+      </w:r>
+      <w:proofErr w:type="spellEnd"/>
+      <w:r>
+        <w:t xml:space="preserve"> and </w:t>
+      </w:r>
+      <w:proofErr w:type="spellStart"/>
+      <w:r>
+        <w:t>downtime_hours</w:t>
+      </w:r>
+      <w:proofErr w:type="spellEnd"/>
+      <w:r>
+        <w:t xml:space="preserve"> to Decimal Number.</w:t>
+      </w:r>
+    </w:p>
+    <w:p>
+      <w:pPr>
+        <w:spacing w:after="0" w:line="240" w:lineRule="auto"/>
+      </w:pPr>
+      <w:r>
+        <w:t xml:space="preserve">- Kept the original </w:t>
+      </w:r>
+      <w:proofErr w:type="spellStart"/>
+      <w:r>
+        <w:t>failure_code</w:t>
+      </w:r>
+      <w:proofErr w:type="spellEnd"/>
+      <w:r>
+        <w:t xml:space="preserve"> column as the source value.</w:t>
+      </w:r>
+    </w:p>
+    <w:p>
+      <w:pPr>
+        <w:spacing w:after="0" w:line="240" w:lineRule="auto"/>
+      </w:pPr>
+      <w:r>
+        <w:t xml:space="preserve">- Created </w:t>
+      </w:r>
+      <w:proofErr w:type="spellStart"/>
+      <w:r>
+        <w:t>Failure_Category_Standardised</w:t>
+      </w:r>
+      <w:proofErr w:type="spellEnd"/>
+      <w:r>
+        <w:t xml:space="preserve"> to convert inconsistent failure codes into full readable categories.</w:t>
+      </w:r>
+    </w:p>
+    <w:p>
+      <w:pPr>
+        <w:spacing w:after="0" w:line="240" w:lineRule="auto"/>
+      </w:pPr>
+      <w:r>
+        <w:t>- Standardised labels such as ELEC, Elec and Electrical into Electrical.</w:t>
+      </w:r>
+    </w:p>
+    <w:p>
+      <w:pPr>
+        <w:spacing w:after="0" w:line="240" w:lineRule="auto"/>
+      </w:pPr>
+      <w:r>
+        <w:t>- Standardised labels such as HYD and HYDRAULICS into Hydraulics.</w:t>
+      </w:r>
+    </w:p>
+    <w:p>
+      <w:pPr>
+        <w:spacing w:after="0" w:line="240" w:lineRule="auto"/>
+      </w:pPr>
+      <w:r>
+        <w:t>- Standardised labels such as TRANS into Transmission.</w:t>
+      </w:r>
+    </w:p>
+    <w:p>
+      <w:pPr>
+        <w:spacing w:after="0" w:line="240" w:lineRule="auto"/>
+      </w:pPr>
+      <w:r>
+        <w:t>- Standardised labels such as TYR and TYRES into Tyres.</w:t>
+      </w:r>
+    </w:p>
+    <w:p>
+      <w:pPr>
+        <w:spacing w:after="0" w:line="240" w:lineRule="auto"/>
+      </w:pPr>
+      <w:r>
+        <w:t>- Standardised UC into Undercarriage.</w:t>
+      </w:r>
+    </w:p>
+    <w:p>
+      <w:pPr>
+        <w:spacing w:after="0" w:line="240" w:lineRule="auto"/>
+      </w:pPr>
+      <w:r>
+        <w:t>- Reclassified planned preventive maintenance records as Preventive Maintenance.</w:t>
+      </w:r>
+    </w:p>
+    <w:p>
+      <w:pPr>
+        <w:spacing w:after="0" w:line="240" w:lineRule="auto"/>
+      </w:pPr>
+      <w:r>
+        <w:t xml:space="preserve">- Replaced </w:t>
+      </w:r>
+      <w:proofErr w:type="spellStart"/>
+      <w:r>
+        <w:t>date_raised</w:t>
+      </w:r>
+      <w:proofErr w:type="spellEnd"/>
+      <w:r>
+        <w:t xml:space="preserve"> errors with null so invalid date values could be handled consistently.</w:t>
+      </w:r>
+    </w:p>
+    <w:p>
+      <w:pPr>
+        <w:spacing w:after="0" w:line="240" w:lineRule="auto"/>
+      </w:pPr>
+      <w:r>
+        <w:t xml:space="preserve">- Created </w:t>
+      </w:r>
+      <w:proofErr w:type="spellStart"/>
+      <w:r>
+        <w:t>Work_Order_Quality_Flag</w:t>
+      </w:r>
+      <w:proofErr w:type="spellEnd"/>
+      <w:r>
+        <w:t xml:space="preserve"> to classify records as Valid work order, </w:t>
+      </w:r>
+      <w:proofErr w:type="gramStart"/>
+      <w:r>
+        <w:t>Missing</w:t>
+      </w:r>
+      <w:proofErr w:type="gramEnd"/>
+      <w:r>
+        <w:t xml:space="preserve"> actual finish date, Missing or invalid date raised, or </w:t>
+      </w:r>
+      <w:proofErr w:type="gramStart"/>
+      <w:r>
+        <w:t>Missing</w:t>
+      </w:r>
+      <w:proofErr w:type="gramEnd"/>
+      <w:r>
+        <w:t xml:space="preserve"> planned start date.</w:t>
+      </w:r>
+    </w:p>
+    <w:p>
+      <w:pPr>
+        <w:spacing w:after="0" w:line="240" w:lineRule="auto"/>
+      </w:pPr>
+      <w:r>
+        <w:t xml:space="preserve">- Created </w:t>
+      </w:r>
+      <w:proofErr w:type="spellStart"/>
+      <w:r>
+        <w:t>Include_In_Work_Order_Analysis</w:t>
+      </w:r>
+      <w:proofErr w:type="spellEnd"/>
+      <w:r>
+        <w:t xml:space="preserve"> as a True/False flag to identify records safe to include in work order KPI calculations.</w:t>
+      </w:r>
+    </w:p>
+    <w:p>
+      <w:pPr>
+        <w:spacing w:after="0" w:line="240" w:lineRule="auto"/>
+      </w:pPr>
+    </w:p>
+    <w:p>
+      <w:pPr>
+        <w:spacing w:after="0" w:line="240" w:lineRule="auto"/>
+      </w:pPr>
+      <w:r>
+        <w:t>Cleaning decision:</w:t>
+      </w:r>
+    </w:p>
+    <w:p>
+      <w:pPr>
+        <w:spacing w:after="0" w:line="240" w:lineRule="auto"/>
+      </w:pPr>
+      <w:r>
+        <w:t xml:space="preserve">Original source columns were retained where possible. Cleaned analysis columns were created beside them to support auditability. Missing or invalid </w:t>
+      </w:r>
+      <w:proofErr w:type="spellStart"/>
+      <w:r>
+        <w:t>date_raised</w:t>
+      </w:r>
+      <w:proofErr w:type="spellEnd"/>
+      <w:r>
+        <w:t xml:space="preserve"> values were not guessed or manually corrected. They were converted to null and flagged. Planned start dates were only treated as a quality issue where appropriate, rather than assuming all unplanned work orders required a planned start date.</w:t>
+      </w:r>
+    </w:p>
+    <w:p>
+      <w:pPr>
+        <w:spacing w:after="0" w:line="240" w:lineRule="auto"/>
+      </w:pPr>
+    </w:p>
+    <w:p>
+      <w:pPr>
+        <w:spacing w:after="0" w:line="240" w:lineRule="auto"/>
+      </w:pPr>
+      <w:r>
+        <w:t>Accessibility and dashboard-readiness decision:</w:t>
+      </w:r>
+    </w:p>
+    <w:p>
+      <w:pPr>
+        <w:spacing w:after="0" w:line="240" w:lineRule="auto"/>
+      </w:pPr>
+      <w:r>
+        <w:t>Failure categories were standardised as full readable names rather than short codes. This supports clearer dashboard labels, reduces the need for later renaming in visuals, and makes the report easier to understand for users who may not know maintenance abbreviations.</w:t>
+      </w:r>
+    </w:p>
+    <w:p>
+      <w:pPr>
+        <w:spacing w:after="0" w:line="240" w:lineRule="auto"/>
+      </w:pPr>
+    </w:p>
+    <w:p>
+      <w:pPr>
+        <w:spacing w:after="0" w:line="240" w:lineRule="auto"/>
+      </w:pPr>
+      <w:r>
+        <w:t>Impact on analysis:</w:t>
+      </w:r>
+    </w:p>
+    <w:p>
+      <w:pPr>
+        <w:spacing w:after="0" w:line="240" w:lineRule="auto"/>
+      </w:pPr>
+      <w:r>
+        <w:t xml:space="preserve">Work order KPIs can now use </w:t>
+      </w:r>
+      <w:proofErr w:type="spellStart"/>
+      <w:r>
+        <w:t>Include_In_Work_Order_Analysis</w:t>
+      </w:r>
+      <w:proofErr w:type="spellEnd"/>
+      <w:r>
+        <w:t xml:space="preserve"> to exclude incomplete or invalid records while keeping those records available for data-quality reporting. Failure category analysis will use readable, standardised categories that are suitable for dashboard visuals.</w:t>
+      </w:r>
       <w:r>
         <w:tab/>
       </w:r>

</xml_diff>

<commit_message>
Complete shift operations Power Query cleaning
Cleaned the shift operations staging table, added quality and asset match flags, updated inclusion logic for KPI analysis, and documented the final Power Query cleaning stage.
</commit_message>
<xml_diff>
--- a/06_docs/Data_Cleaning_Log.docx
+++ b/06_docs/Data_Cleaning_Log.docx
@@ -2938,23 +2938,7 @@
       </w:r>
       <w:proofErr w:type="spellEnd"/>
       <w:r>
-        <w:t xml:space="preserve"> to classify records as Valid work order, </w:t>
-      </w:r>
-      <w:proofErr w:type="gramStart"/>
-      <w:r>
-        <w:t>Missing</w:t>
-      </w:r>
-      <w:proofErr w:type="gramEnd"/>
-      <w:r>
-        <w:t xml:space="preserve"> actual finish date, Missing or invalid date raised, or </w:t>
-      </w:r>
-      <w:proofErr w:type="gramStart"/>
-      <w:r>
-        <w:t>Missing</w:t>
-      </w:r>
-      <w:proofErr w:type="gramEnd"/>
-      <w:r>
-        <w:t xml:space="preserve"> planned start date.</w:t>
+        <w:t xml:space="preserve"> to classify records as Valid work order, Missing actual finish date, Missing or invalid date raised, or Missing planned start date.</w:t>
       </w:r>
     </w:p>
     <w:p>
@@ -3053,6 +3037,499 @@
       </w:r>
       <w:r>
         <w:tab/>
+      </w:r>
+    </w:p>
+    <w:p>
+      <w:pPr>
+        <w:spacing w:after="0" w:line="240" w:lineRule="auto"/>
+      </w:pPr>
+    </w:p>
+    <w:p>
+      <w:pPr>
+        <w:spacing w:after="0" w:line="240" w:lineRule="auto"/>
+      </w:pPr>
+      <w:r>
+        <w:tab/>
+      </w:r>
+      <w:r>
+        <w:t>shift_operations_log.csv</w:t>
+      </w:r>
+    </w:p>
+    <w:p>
+      <w:pPr>
+        <w:spacing w:after="0" w:line="240" w:lineRule="auto"/>
+      </w:pPr>
+    </w:p>
+    <w:p>
+      <w:pPr>
+        <w:spacing w:after="0" w:line="240" w:lineRule="auto"/>
+      </w:pPr>
+      <w:r>
+        <w:t>Power Query cleaning update:</w:t>
+      </w:r>
+    </w:p>
+    <w:p>
+      <w:pPr>
+        <w:spacing w:after="0" w:line="240" w:lineRule="auto"/>
+      </w:pPr>
+      <w:r>
+        <w:t xml:space="preserve">- Imported shift_operations_log.csv into Power Query and renamed the query to </w:t>
+      </w:r>
+      <w:proofErr w:type="spellStart"/>
+      <w:r>
+        <w:t>stg_shift_operations_log</w:t>
+      </w:r>
+      <w:proofErr w:type="spellEnd"/>
+      <w:r>
+        <w:t>.</w:t>
+      </w:r>
+    </w:p>
+    <w:p>
+      <w:pPr>
+        <w:spacing w:after="0" w:line="240" w:lineRule="auto"/>
+      </w:pPr>
+      <w:r>
+        <w:t xml:space="preserve">- Confirmed the expected columns were present: </w:t>
+      </w:r>
+      <w:proofErr w:type="spellStart"/>
+      <w:r>
+        <w:t>shift_log_id</w:t>
+      </w:r>
+      <w:proofErr w:type="spellEnd"/>
+      <w:r>
+        <w:t xml:space="preserve">, date, </w:t>
+      </w:r>
+      <w:proofErr w:type="spellStart"/>
+      <w:r>
+        <w:t>shift_type</w:t>
+      </w:r>
+      <w:proofErr w:type="spellEnd"/>
+      <w:r>
+        <w:t xml:space="preserve">, </w:t>
+      </w:r>
+      <w:proofErr w:type="spellStart"/>
+      <w:r>
+        <w:t>asset_id</w:t>
+      </w:r>
+      <w:proofErr w:type="spellEnd"/>
+      <w:r>
+        <w:t xml:space="preserve">, </w:t>
+      </w:r>
+      <w:proofErr w:type="spellStart"/>
+      <w:r>
+        <w:t>crew_id</w:t>
+      </w:r>
+      <w:proofErr w:type="spellEnd"/>
+      <w:r>
+        <w:t xml:space="preserve">, </w:t>
+      </w:r>
+      <w:proofErr w:type="spellStart"/>
+      <w:r>
+        <w:t>scheduled_hours</w:t>
+      </w:r>
+      <w:proofErr w:type="spellEnd"/>
+      <w:r>
+        <w:t xml:space="preserve">, </w:t>
+      </w:r>
+      <w:proofErr w:type="spellStart"/>
+      <w:r>
+        <w:t>operating_hours</w:t>
+      </w:r>
+      <w:proofErr w:type="spellEnd"/>
+      <w:r>
+        <w:t xml:space="preserve">, </w:t>
+      </w:r>
+      <w:proofErr w:type="spellStart"/>
+      <w:r>
+        <w:t>idle_hours</w:t>
+      </w:r>
+      <w:proofErr w:type="spellEnd"/>
+      <w:r>
+        <w:t xml:space="preserve">, </w:t>
+      </w:r>
+      <w:proofErr w:type="spellStart"/>
+      <w:r>
+        <w:t>downtime_hours</w:t>
+      </w:r>
+      <w:proofErr w:type="spellEnd"/>
+      <w:r>
+        <w:t xml:space="preserve">, </w:t>
+      </w:r>
+      <w:proofErr w:type="spellStart"/>
+      <w:r>
+        <w:t>tonnes_moved</w:t>
+      </w:r>
+      <w:proofErr w:type="spellEnd"/>
+      <w:r>
+        <w:t xml:space="preserve">, </w:t>
+      </w:r>
+      <w:proofErr w:type="spellStart"/>
+      <w:r>
+        <w:t>metres_drilled</w:t>
+      </w:r>
+      <w:proofErr w:type="spellEnd"/>
+      <w:r>
+        <w:t xml:space="preserve">, </w:t>
+      </w:r>
+      <w:proofErr w:type="spellStart"/>
+      <w:r>
+        <w:t>weather_condition</w:t>
+      </w:r>
+      <w:proofErr w:type="spellEnd"/>
+      <w:r>
+        <w:t xml:space="preserve"> and </w:t>
+      </w:r>
+      <w:proofErr w:type="spellStart"/>
+      <w:r>
+        <w:t>operator_id</w:t>
+      </w:r>
+      <w:proofErr w:type="spellEnd"/>
+      <w:r>
+        <w:t>.</w:t>
+      </w:r>
+    </w:p>
+    <w:p>
+      <w:pPr>
+        <w:spacing w:after="0" w:line="240" w:lineRule="auto"/>
+      </w:pPr>
+      <w:r>
+        <w:t xml:space="preserve">- Confirmed </w:t>
+      </w:r>
+      <w:proofErr w:type="spellStart"/>
+      <w:r>
+        <w:t>scheduled_hours</w:t>
+      </w:r>
+      <w:proofErr w:type="spellEnd"/>
+      <w:r>
+        <w:t xml:space="preserve">, </w:t>
+      </w:r>
+      <w:proofErr w:type="spellStart"/>
+      <w:r>
+        <w:t>operating_hours</w:t>
+      </w:r>
+      <w:proofErr w:type="spellEnd"/>
+      <w:r>
+        <w:t xml:space="preserve">, </w:t>
+      </w:r>
+      <w:proofErr w:type="spellStart"/>
+      <w:r>
+        <w:t>idle_hours</w:t>
+      </w:r>
+      <w:proofErr w:type="spellEnd"/>
+      <w:r>
+        <w:t xml:space="preserve">, </w:t>
+      </w:r>
+      <w:proofErr w:type="spellStart"/>
+      <w:r>
+        <w:t>downtime_hours</w:t>
+      </w:r>
+      <w:proofErr w:type="spellEnd"/>
+      <w:r>
+        <w:t xml:space="preserve">, </w:t>
+      </w:r>
+      <w:proofErr w:type="spellStart"/>
+      <w:r>
+        <w:t>tonnes_moved</w:t>
+      </w:r>
+      <w:proofErr w:type="spellEnd"/>
+      <w:r>
+        <w:t xml:space="preserve"> and </w:t>
+      </w:r>
+      <w:proofErr w:type="spellStart"/>
+      <w:r>
+        <w:t>metres_drilled</w:t>
+      </w:r>
+      <w:proofErr w:type="spellEnd"/>
+      <w:r>
+        <w:t xml:space="preserve"> were set as Decimal Number.</w:t>
+      </w:r>
+    </w:p>
+    <w:p>
+      <w:pPr>
+        <w:spacing w:after="0" w:line="240" w:lineRule="auto"/>
+      </w:pPr>
+      <w:r>
+        <w:lastRenderedPageBreak/>
+        <w:t>- Replaced date errors with null so invalid dates could be handled consistently.</w:t>
+      </w:r>
+    </w:p>
+    <w:p>
+      <w:pPr>
+        <w:spacing w:after="0" w:line="240" w:lineRule="auto"/>
+      </w:pPr>
+      <w:r>
+        <w:t xml:space="preserve">- Created </w:t>
+      </w:r>
+      <w:proofErr w:type="spellStart"/>
+      <w:r>
+        <w:t>Shift_Log_Quality_Flag</w:t>
+      </w:r>
+      <w:proofErr w:type="spellEnd"/>
+      <w:r>
+        <w:t xml:space="preserve"> to identify invalid operational records.</w:t>
+      </w:r>
+    </w:p>
+    <w:p>
+      <w:pPr>
+        <w:spacing w:after="0" w:line="240" w:lineRule="auto"/>
+      </w:pPr>
+      <w:r>
+        <w:t>- The quality flag identified records with missing or invalid date, negative operating hours and negative downtime hours.</w:t>
+      </w:r>
+    </w:p>
+    <w:p>
+      <w:pPr>
+        <w:spacing w:after="0" w:line="240" w:lineRule="auto"/>
+      </w:pPr>
+      <w:r>
+        <w:t xml:space="preserve">- Created </w:t>
+      </w:r>
+      <w:proofErr w:type="spellStart"/>
+      <w:r>
+        <w:t>Asset_ID_Standardised</w:t>
+      </w:r>
+      <w:proofErr w:type="spellEnd"/>
+      <w:r>
+        <w:t xml:space="preserve"> to standardise asset IDs into the same format as the asset register.</w:t>
+      </w:r>
+    </w:p>
+    <w:p>
+      <w:pPr>
+        <w:spacing w:after="0" w:line="240" w:lineRule="auto"/>
+      </w:pPr>
+      <w:r>
+        <w:t xml:space="preserve">- Merged </w:t>
+      </w:r>
+      <w:proofErr w:type="spellStart"/>
+      <w:r>
+        <w:t>stg_shift_operations_log</w:t>
+      </w:r>
+      <w:proofErr w:type="spellEnd"/>
+      <w:r>
+        <w:t xml:space="preserve"> with </w:t>
+      </w:r>
+      <w:proofErr w:type="spellStart"/>
+      <w:r>
+        <w:t>stg_asset_register</w:t>
+      </w:r>
+      <w:proofErr w:type="spellEnd"/>
+      <w:r>
+        <w:t xml:space="preserve"> using </w:t>
+      </w:r>
+      <w:proofErr w:type="spellStart"/>
+      <w:r>
+        <w:t>Asset_ID_Standardised</w:t>
+      </w:r>
+      <w:proofErr w:type="spellEnd"/>
+      <w:r>
+        <w:t xml:space="preserve"> to check whether each operational asset existed in the official asset register.</w:t>
+      </w:r>
+    </w:p>
+    <w:p>
+      <w:pPr>
+        <w:spacing w:after="0" w:line="240" w:lineRule="auto"/>
+      </w:pPr>
+      <w:r>
+        <w:t xml:space="preserve">- Expanded </w:t>
+      </w:r>
+      <w:proofErr w:type="spellStart"/>
+      <w:r>
+        <w:t>asset_name</w:t>
+      </w:r>
+      <w:proofErr w:type="spellEnd"/>
+      <w:r>
+        <w:t xml:space="preserve"> and </w:t>
+      </w:r>
+      <w:proofErr w:type="spellStart"/>
+      <w:r>
+        <w:t>asset_class</w:t>
+      </w:r>
+      <w:proofErr w:type="spellEnd"/>
+      <w:r>
+        <w:t xml:space="preserve"> from </w:t>
+      </w:r>
+      <w:proofErr w:type="spellStart"/>
+      <w:r>
+        <w:t>stg_asset_register</w:t>
+      </w:r>
+      <w:proofErr w:type="spellEnd"/>
+      <w:r>
+        <w:t>.</w:t>
+      </w:r>
+    </w:p>
+    <w:p>
+      <w:pPr>
+        <w:spacing w:after="0" w:line="240" w:lineRule="auto"/>
+      </w:pPr>
+      <w:r>
+        <w:t xml:space="preserve">- Created </w:t>
+      </w:r>
+      <w:proofErr w:type="spellStart"/>
+      <w:r>
+        <w:t>Asset_Match_Flag</w:t>
+      </w:r>
+      <w:proofErr w:type="spellEnd"/>
+      <w:r>
+        <w:t xml:space="preserve"> to identify whether each shift log asset matched the asset register.</w:t>
+      </w:r>
+    </w:p>
+    <w:p>
+      <w:pPr>
+        <w:spacing w:after="0" w:line="240" w:lineRule="auto"/>
+      </w:pPr>
+      <w:r>
+        <w:t>- The merge matched 47,095 of 47,106 rows, leaving 11 rows where the asset was not found in the asset register.</w:t>
+      </w:r>
+    </w:p>
+    <w:p>
+      <w:pPr>
+        <w:spacing w:after="0" w:line="240" w:lineRule="auto"/>
+      </w:pPr>
+      <w:r>
+        <w:t xml:space="preserve">- Created </w:t>
+      </w:r>
+      <w:proofErr w:type="spellStart"/>
+      <w:r>
+        <w:t>Include_In_Shift_Analysis</w:t>
+      </w:r>
+      <w:proofErr w:type="spellEnd"/>
+      <w:r>
+        <w:t xml:space="preserve"> as a True/False flag.</w:t>
+      </w:r>
+    </w:p>
+    <w:p>
+      <w:pPr>
+        <w:spacing w:after="0" w:line="240" w:lineRule="auto"/>
+      </w:pPr>
+      <w:r>
+        <w:t xml:space="preserve">- </w:t>
+      </w:r>
+      <w:proofErr w:type="spellStart"/>
+      <w:r>
+        <w:t>Include_In_Shift_Analysis</w:t>
+      </w:r>
+      <w:proofErr w:type="spellEnd"/>
+      <w:r>
+        <w:t xml:space="preserve"> is TRUE only when </w:t>
+      </w:r>
+      <w:proofErr w:type="spellStart"/>
+      <w:r>
+        <w:t>Shift_Log_Quality_Flag</w:t>
+      </w:r>
+      <w:proofErr w:type="spellEnd"/>
+      <w:r>
+        <w:t xml:space="preserve"> = Valid shift log and </w:t>
+      </w:r>
+      <w:proofErr w:type="spellStart"/>
+      <w:r>
+        <w:t>Asset_Match_Flag</w:t>
+      </w:r>
+      <w:proofErr w:type="spellEnd"/>
+      <w:r>
+        <w:t xml:space="preserve"> = Asset matched.</w:t>
+      </w:r>
+    </w:p>
+    <w:p>
+      <w:pPr>
+        <w:spacing w:after="0" w:line="240" w:lineRule="auto"/>
+      </w:pPr>
+    </w:p>
+    <w:p>
+      <w:pPr>
+        <w:spacing w:after="0" w:line="240" w:lineRule="auto"/>
+      </w:pPr>
+      <w:r>
+        <w:t>Cleaning decision:</w:t>
+      </w:r>
+    </w:p>
+    <w:p>
+      <w:pPr>
+        <w:spacing w:after="0" w:line="240" w:lineRule="auto"/>
+      </w:pPr>
+      <w:r>
+        <w:t xml:space="preserve">Invalid dates were converted to null and flagged rather than manually corrected. Negative operating and downtime hours were flagged as quality issues rather than overwritten. Null </w:t>
+      </w:r>
+      <w:proofErr w:type="spellStart"/>
+      <w:r>
+        <w:t>tonnes_moved</w:t>
+      </w:r>
+      <w:proofErr w:type="spellEnd"/>
+      <w:r>
+        <w:t xml:space="preserve"> and null </w:t>
+      </w:r>
+      <w:proofErr w:type="spellStart"/>
+      <w:r>
+        <w:t>metres_drilled</w:t>
+      </w:r>
+      <w:proofErr w:type="spellEnd"/>
+      <w:r>
+        <w:t xml:space="preserve"> were not treated as automatic errors because their meaning depends on asset class. For example, drill rigs may have metres drilled, while haul trucks and loaders are more likely to have tonnes moved.</w:t>
+      </w:r>
+    </w:p>
+    <w:p>
+      <w:pPr>
+        <w:spacing w:after="0" w:line="240" w:lineRule="auto"/>
+      </w:pPr>
+    </w:p>
+    <w:p>
+      <w:pPr>
+        <w:spacing w:after="0" w:line="240" w:lineRule="auto"/>
+      </w:pPr>
+      <w:r>
+        <w:t>Data governance decision:</w:t>
+      </w:r>
+    </w:p>
+    <w:p>
+      <w:pPr>
+        <w:spacing w:after="0" w:line="240" w:lineRule="auto"/>
+      </w:pPr>
+      <w:r>
+        <w:t xml:space="preserve">The original </w:t>
+      </w:r>
+      <w:proofErr w:type="spellStart"/>
+      <w:r>
+        <w:t>asset_id</w:t>
+      </w:r>
+      <w:proofErr w:type="spellEnd"/>
+      <w:r>
+        <w:t xml:space="preserve"> column was retained for auditability. A separate </w:t>
+      </w:r>
+      <w:proofErr w:type="spellStart"/>
+      <w:r>
+        <w:t>Asset_ID_Standardised</w:t>
+      </w:r>
+      <w:proofErr w:type="spellEnd"/>
+      <w:r>
+        <w:t xml:space="preserve"> column was created for matching and analysis. The operational table was checked against the asset register so unmatched asset records could be retained for governance reporting but excluded from KPI analysis.</w:t>
+      </w:r>
+    </w:p>
+    <w:p>
+      <w:pPr>
+        <w:spacing w:after="0" w:line="240" w:lineRule="auto"/>
+      </w:pPr>
+    </w:p>
+    <w:p>
+      <w:pPr>
+        <w:spacing w:after="0" w:line="240" w:lineRule="auto"/>
+      </w:pPr>
+      <w:r>
+        <w:t>Impact on analysis:</w:t>
+      </w:r>
+    </w:p>
+    <w:p>
+      <w:pPr>
+        <w:spacing w:after="0" w:line="240" w:lineRule="auto"/>
+      </w:pPr>
+      <w:r>
+        <w:t xml:space="preserve">Shift operation KPIs can now use </w:t>
+      </w:r>
+      <w:proofErr w:type="spellStart"/>
+      <w:r>
+        <w:t>Include_In_Shift_Analysis</w:t>
+      </w:r>
+      <w:proofErr w:type="spellEnd"/>
+      <w:r>
+        <w:t xml:space="preserve"> to exclude rows with invalid dates, negative hours or unmatched assets. Data quality reporting can still show the excluded records, which supports transparency instead of hiding data issues.</w:t>
       </w:r>
     </w:p>
     <w:sectPr>

</xml_diff>